<commit_message>
Update student details to Grade 9 A, Lakshmipat Singhania Academy across template docx, pdf, and website
</commit_message>
<xml_diff>
--- a/IBM_SkillsBuild_Shop_Assistant_Chatbot_Completed_Template.docx
+++ b/IBM_SkillsBuild_Shop_Assistant_Chatbot_Completed_Template.docx
@@ -82,7 +82,7 @@
           <w:b/>
           <w:sz w:val="22"/>
         </w:rPr>
-        <w:t>Class, Section and Roll No.: Grade 10 — Computer Science (Roll No. 17)</w:t>
+        <w:t>Class, Section and Roll No.: Grade 9 A</w:t>
       </w:r>
     </w:p>
     <w:p>
@@ -91,7 +91,7 @@
           <w:b/>
           <w:sz w:val="22"/>
         </w:rPr>
-        <w:t>School Name: Delhi Public School / St. Xavier's High School</w:t>
+        <w:t>School Name: Lakshmipat Singhania Academy</w:t>
       </w:r>
     </w:p>
     <w:p>

</xml_diff>

<commit_message>
Restore all pages and update actual screenshots and student details
</commit_message>
<xml_diff>
--- a/IBM_SkillsBuild_Shop_Assistant_Chatbot_Completed_Template.docx
+++ b/IBM_SkillsBuild_Shop_Assistant_Chatbot_Completed_Template.docx
@@ -1132,7 +1132,7 @@
             <w:r>
               <w:drawing>
                 <wp:inline xmlns:a="http://schemas.openxmlformats.org/drawingml/2006/main" xmlns:pic="http://schemas.openxmlformats.org/drawingml/2006/picture">
-                  <wp:extent cx="5303520" cy="3729038"/>
+                  <wp:extent cx="5303520" cy="3397568"/>
                   <wp:docPr id="3" name="Picture 3"/>
                   <wp:cNvGraphicFramePr>
                     <a:graphicFrameLocks noChangeAspect="1"/>
@@ -1141,7 +1141,7 @@
                     <a:graphicData uri="http://schemas.openxmlformats.org/drawingml/2006/picture">
                       <pic:pic>
                         <pic:nvPicPr>
-                          <pic:cNvPr id="0" name="chatbot_active_preview.png"/>
+                          <pic:cNvPr id="0" name="actual_chatbot_fullscreen.png"/>
                           <pic:cNvPicPr/>
                         </pic:nvPicPr>
                         <pic:blipFill>
@@ -1153,7 +1153,7 @@
                         <pic:spPr>
                           <a:xfrm>
                             <a:off x="0" y="0"/>
-                            <a:ext cx="5303520" cy="3729038"/>
+                            <a:ext cx="5303520" cy="3397568"/>
                           </a:xfrm>
                           <a:prstGeom prst="rect"/>
                         </pic:spPr>
@@ -1174,7 +1174,7 @@
                 <w:color w:val="64748B"/>
                 <w:sz w:val="18"/>
               </w:rPr>
-              <w:t>Figure C: PulseBot answering customer inquiries about store hours, policies, and offers.</w:t>
+              <w:t>Figure C: Actual live PulseBot dedicated AI Chatbot interface answering customer inquiries (Grade 9 A, Lakshmipat Singhania Academy).</w:t>
             </w:r>
           </w:p>
         </w:tc>
@@ -1235,7 +1235,7 @@
             <w:r>
               <w:drawing>
                 <wp:inline xmlns:a="http://schemas.openxmlformats.org/drawingml/2006/main" xmlns:pic="http://schemas.openxmlformats.org/drawingml/2006/picture">
-                  <wp:extent cx="5303520" cy="3729038"/>
+                  <wp:extent cx="5303520" cy="3397568"/>
                   <wp:docPr id="4" name="Picture 4"/>
                   <wp:cNvGraphicFramePr>
                     <a:graphicFrameLocks noChangeAspect="1"/>
@@ -1244,7 +1244,7 @@
                     <a:graphicData uri="http://schemas.openxmlformats.org/drawingml/2006/picture">
                       <pic:pic>
                         <pic:nvPicPr>
-                          <pic:cNvPr id="0" name="shop_preview.png"/>
+                          <pic:cNvPr id="0" name="actual_storefront.png"/>
                           <pic:cNvPicPr/>
                         </pic:nvPicPr>
                         <pic:blipFill>
@@ -1256,7 +1256,7 @@
                         <pic:spPr>
                           <a:xfrm>
                             <a:off x="0" y="0"/>
-                            <a:ext cx="5303520" cy="3729038"/>
+                            <a:ext cx="5303520" cy="3397568"/>
                           </a:xfrm>
                           <a:prstGeom prst="rect"/>
                         </pic:spPr>
@@ -1277,7 +1277,7 @@
                 <w:color w:val="64748B"/>
                 <w:sz w:val="18"/>
               </w:rPr>
-              <w:t>Figure D: UrbanPulse Outfitters published live storefront with banner, features, and PulseBot widget.</w:t>
+              <w:t>Figure D: Actual published live UrbanPulse Outfitters website with responsive navigation, banner, and PulseBot.</w:t>
             </w:r>
           </w:p>
         </w:tc>

</xml_diff>

<commit_message>
Fix template layout: eliminate empty page 6, perfectly balance 7 pages with full content and live screenshots
</commit_message>
<xml_diff>
--- a/IBM_SkillsBuild_Shop_Assistant_Chatbot_Completed_Template.docx
+++ b/IBM_SkillsBuild_Shop_Assistant_Chatbot_Completed_Template.docx
@@ -102,21 +102,6 @@
         </w:rPr>
         <w:t>Email ID (Used for IBM Skills build Registration): chiraggoenka17512@gmail.com</w:t>
       </w:r>
-    </w:p>
-    <w:p>
-      <w:pPr>
-        <w:pStyle w:val="Heading3"/>
-        <w:spacing w:before="281" w:beforeAutospacing="off" w:after="281" w:afterAutospacing="off"/>
-        <w:rPr>
-          <w:rFonts w:ascii="Aptos" w:hAnsi="Aptos" w:eastAsia="Aptos" w:cs="Aptos"/>
-          <w:b w:val="1"/>
-          <w:bCs w:val="1"/>
-          <w:noProof w:val="0"/>
-          <w:sz w:val="28"/>
-          <w:szCs w:val="28"/>
-          <w:lang w:val="en-US"/>
-        </w:rPr>
-      </w:pPr>
     </w:p>
     <w:p>
       <w:pPr>
@@ -356,32 +341,8 @@
     </w:p>
     <w:p>
       <w:pPr>
-        <w:rPr>
-          <w:b w:val="0"/>
-          <w:bCs w:val="0"/>
-          <w:sz w:val="26"/>
-          <w:szCs w:val="26"/>
-        </w:rPr>
-      </w:pPr>
-    </w:p>
-    <w:p>
-      <w:pPr>
-        <w:rPr>
-          <w:b w:val="1"/>
-          <w:bCs w:val="1"/>
-          <w:sz w:val="26"/>
-          <w:szCs w:val="26"/>
-        </w:rPr>
-      </w:pPr>
-    </w:p>
-    <w:p>
-      <w:r>
-        <w:br w:type="page"/>
-      </w:r>
-    </w:p>
-    <w:p>
-      <w:pPr>
         <w:pStyle w:val="Normal"/>
+        <w:pageBreakBefore/>
       </w:pPr>
       <w:r>
         <w:rPr>
@@ -820,6 +781,9 @@
       </w:r>
     </w:p>
     <w:p>
+      <w:pPr>
+        <w:pageBreakBefore/>
+      </w:pPr>
       <w:r>
         <w:rPr>
           <w:b/>
@@ -848,9 +812,12 @@
             <w:tcW w:w="5184" w:type="dxa"/>
           </w:tcPr>
           <w:p>
+            <w:pPr>
+              <w:spacing w:before="40" w:after="40"/>
+            </w:pPr>
             <w:r>
               <w:rPr>
-                <w:sz w:val="20"/>
+                <w:sz w:val="19"/>
               </w:rPr>
               <w:t>Chatbot Link (Direct Access):</w:t>
             </w:r>
@@ -861,11 +828,14 @@
             <w:tcW w:w="5184" w:type="dxa"/>
           </w:tcPr>
           <w:p>
+            <w:pPr>
+              <w:spacing w:before="40" w:after="40"/>
+            </w:pPr>
             <w:r>
               <w:rPr>
                 <w:b/>
                 <w:color w:val="0284C7"/>
-                <w:sz w:val="20"/>
+                <w:sz w:val="19"/>
               </w:rPr>
               <w:t>https://chiraggoenka17512-coder.github.io/ibm-skillsbuild-shop-chatbot/chatbot.html</w:t>
             </w:r>
@@ -881,9 +851,12 @@
             <w:tcW w:w="5184" w:type="dxa"/>
           </w:tcPr>
           <w:p>
+            <w:pPr>
+              <w:spacing w:before="40" w:after="40"/>
+            </w:pPr>
             <w:r>
               <w:rPr>
-                <w:sz w:val="20"/>
+                <w:sz w:val="19"/>
               </w:rPr>
               <w:t>Shop Website Link (Live Storefront):</w:t>
             </w:r>
@@ -894,11 +867,14 @@
             <w:tcW w:w="5184" w:type="dxa"/>
           </w:tcPr>
           <w:p>
+            <w:pPr>
+              <w:spacing w:before="40" w:after="40"/>
+            </w:pPr>
             <w:r>
               <w:rPr>
                 <w:b/>
                 <w:color w:val="0284C7"/>
-                <w:sz w:val="20"/>
+                <w:sz w:val="19"/>
               </w:rPr>
               <w:t>https://chiraggoenka17512-coder.github.io/ibm-skillsbuild-shop-chatbot/</w:t>
             </w:r>
@@ -939,13 +915,14 @@
           </w:tcPr>
           <w:p>
             <w:pPr>
+              <w:spacing w:before="40" w:after="40"/>
               <w:jc w:val="center"/>
             </w:pPr>
             <w:r/>
             <w:r>
               <w:drawing>
                 <wp:inline xmlns:a="http://schemas.openxmlformats.org/drawingml/2006/main" xmlns:pic="http://schemas.openxmlformats.org/drawingml/2006/picture">
-                  <wp:extent cx="5303520" cy="3231832"/>
+                  <wp:extent cx="4389120" cy="2674620"/>
                   <wp:docPr id="1" name="Picture 1"/>
                   <wp:cNvGraphicFramePr>
                     <a:graphicFrameLocks noChangeAspect="1"/>
@@ -966,7 +943,7 @@
                         <pic:spPr>
                           <a:xfrm>
                             <a:off x="0" y="0"/>
-                            <a:ext cx="5303520" cy="3231832"/>
+                            <a:ext cx="4389120" cy="2674620"/>
                           </a:xfrm>
                           <a:prstGeom prst="rect"/>
                         </pic:spPr>
@@ -979,13 +956,14 @@
           </w:p>
           <w:p>
             <w:pPr>
+              <w:spacing w:before="40" w:after="40"/>
               <w:jc w:val="center"/>
             </w:pPr>
             <w:r>
               <w:rPr>
                 <w:i/>
                 <w:color w:val="64748B"/>
-                <w:sz w:val="18"/>
+                <w:sz w:val="17"/>
               </w:rPr>
               <w:t>Figure A: Fictional Shop Information Document for UrbanPulse Outfitters created using Google Gemini.</w:t>
             </w:r>
@@ -993,11 +971,10 @@
         </w:tc>
       </w:tr>
     </w:tbl>
-    <w:p/>
-    <w:p/>
-    <w:p/>
-    <w:p/>
     <w:p>
+      <w:pPr>
+        <w:pageBreakBefore/>
+      </w:pPr>
       <w:r>
         <w:rPr>
           <w:b/>
@@ -1030,13 +1007,14 @@
           </w:tcPr>
           <w:p>
             <w:pPr>
+              <w:spacing w:before="40" w:after="40"/>
               <w:jc w:val="center"/>
             </w:pPr>
             <w:r/>
             <w:r>
               <w:drawing>
                 <wp:inline xmlns:a="http://schemas.openxmlformats.org/drawingml/2006/main" xmlns:pic="http://schemas.openxmlformats.org/drawingml/2006/picture">
-                  <wp:extent cx="5303520" cy="3231832"/>
+                  <wp:extent cx="3931920" cy="2396014"/>
                   <wp:docPr id="2" name="Picture 2"/>
                   <wp:cNvGraphicFramePr>
                     <a:graphicFrameLocks noChangeAspect="1"/>
@@ -1057,7 +1035,7 @@
                         <pic:spPr>
                           <a:xfrm>
                             <a:off x="0" y="0"/>
-                            <a:ext cx="5303520" cy="3231832"/>
+                            <a:ext cx="3931920" cy="2396014"/>
                           </a:xfrm>
                           <a:prstGeom prst="rect"/>
                         </pic:spPr>
@@ -1070,13 +1048,14 @@
           </w:p>
           <w:p>
             <w:pPr>
+              <w:spacing w:before="40" w:after="40"/>
               <w:jc w:val="center"/>
             </w:pPr>
             <w:r>
               <w:rPr>
                 <w:i/>
                 <w:color w:val="64748B"/>
-                <w:sz w:val="18"/>
+                <w:sz w:val="17"/>
               </w:rPr>
               <w:t>Figure B: PulseBot AI Chatbot configuration and Knowledge Source document integration.</w:t>
             </w:r>
@@ -1084,15 +1063,6 @@
         </w:tc>
       </w:tr>
     </w:tbl>
-    <w:p/>
-    <w:p>
-      <w:pPr>
-        <w:rPr>
-          <w:b/>
-          <w:sz w:val="24"/>
-        </w:rPr>
-      </w:pPr>
-    </w:p>
     <w:p>
       <w:r>
         <w:rPr>
@@ -1126,13 +1096,14 @@
           </w:tcPr>
           <w:p>
             <w:pPr>
+              <w:spacing w:before="40" w:after="40"/>
               <w:jc w:val="center"/>
             </w:pPr>
             <w:r/>
             <w:r>
               <w:drawing>
                 <wp:inline xmlns:a="http://schemas.openxmlformats.org/drawingml/2006/main" xmlns:pic="http://schemas.openxmlformats.org/drawingml/2006/picture">
-                  <wp:extent cx="5303520" cy="3397568"/>
+                  <wp:extent cx="3931920" cy="2518886"/>
                   <wp:docPr id="3" name="Picture 3"/>
                   <wp:cNvGraphicFramePr>
                     <a:graphicFrameLocks noChangeAspect="1"/>
@@ -1153,7 +1124,7 @@
                         <pic:spPr>
                           <a:xfrm>
                             <a:off x="0" y="0"/>
-                            <a:ext cx="5303520" cy="3397568"/>
+                            <a:ext cx="3931920" cy="2518886"/>
                           </a:xfrm>
                           <a:prstGeom prst="rect"/>
                         </pic:spPr>
@@ -1166,37 +1137,25 @@
           </w:p>
           <w:p>
             <w:pPr>
+              <w:spacing w:before="40" w:after="40"/>
               <w:jc w:val="center"/>
             </w:pPr>
             <w:r>
               <w:rPr>
                 <w:i/>
                 <w:color w:val="64748B"/>
-                <w:sz w:val="18"/>
+                <w:sz w:val="17"/>
               </w:rPr>
-              <w:t>Figure C: Actual live PulseBot dedicated AI Chatbot interface answering customer inquiries (Grade 9 A, Lakshmipat Singhania Academy).</w:t>
+              <w:t>Figure C: Actual live PulseBot dedicated AI Chatbot interface (Grade 9 A, Lakshmipat Singhania Academy).</w:t>
             </w:r>
           </w:p>
         </w:tc>
       </w:tr>
     </w:tbl>
-    <w:p/>
     <w:p>
       <w:pPr>
-        <w:rPr>
-          <w:b/>
-          <w:sz w:val="24"/>
-        </w:rPr>
-      </w:pPr>
-      <w:r>
-        <w:rPr>
-          <w:b/>
-          <w:sz w:val="24"/>
-        </w:rPr>
-        <w:br w:type="page"/>
-      </w:r>
-    </w:p>
-    <w:p>
+        <w:pageBreakBefore/>
+      </w:pPr>
       <w:r>
         <w:rPr>
           <w:b/>
@@ -1229,13 +1188,14 @@
           </w:tcPr>
           <w:p>
             <w:pPr>
+              <w:spacing w:before="40" w:after="40"/>
               <w:jc w:val="center"/>
             </w:pPr>
             <w:r/>
             <w:r>
               <w:drawing>
                 <wp:inline xmlns:a="http://schemas.openxmlformats.org/drawingml/2006/main" xmlns:pic="http://schemas.openxmlformats.org/drawingml/2006/picture">
-                  <wp:extent cx="5303520" cy="3397568"/>
+                  <wp:extent cx="3931920" cy="2518886"/>
                   <wp:docPr id="4" name="Picture 4"/>
                   <wp:cNvGraphicFramePr>
                     <a:graphicFrameLocks noChangeAspect="1"/>
@@ -1256,7 +1216,7 @@
                         <pic:spPr>
                           <a:xfrm>
                             <a:off x="0" y="0"/>
-                            <a:ext cx="5303520" cy="3397568"/>
+                            <a:ext cx="3931920" cy="2518886"/>
                           </a:xfrm>
                           <a:prstGeom prst="rect"/>
                         </pic:spPr>
@@ -1269,21 +1229,21 @@
           </w:p>
           <w:p>
             <w:pPr>
+              <w:spacing w:before="40" w:after="40"/>
               <w:jc w:val="center"/>
             </w:pPr>
             <w:r>
               <w:rPr>
                 <w:i/>
                 <w:color w:val="64748B"/>
-                <w:sz w:val="18"/>
+                <w:sz w:val="17"/>
               </w:rPr>
-              <w:t>Figure D: Actual published live UrbanPulse Outfitters website with responsive navigation, banner, and PulseBot.</w:t>
+              <w:t>Figure D: Actual published live UrbanPulse Outfitters website with responsive navigation and PulseBot.</w:t>
             </w:r>
           </w:p>
         </w:tc>
       </w:tr>
     </w:tbl>
-    <w:p/>
     <w:p>
       <w:r>
         <w:rPr>
@@ -1317,13 +1277,14 @@
           </w:tcPr>
           <w:p>
             <w:pPr>
+              <w:spacing w:before="40" w:after="40"/>
               <w:jc w:val="center"/>
             </w:pPr>
             <w:r/>
             <w:r>
               <w:drawing>
                 <wp:inline xmlns:a="http://schemas.openxmlformats.org/drawingml/2006/main" xmlns:pic="http://schemas.openxmlformats.org/drawingml/2006/picture">
-                  <wp:extent cx="5303520" cy="4972050"/>
+                  <wp:extent cx="3931920" cy="2764631"/>
                   <wp:docPr id="5" name="Picture 5"/>
                   <wp:cNvGraphicFramePr>
                     <a:graphicFrameLocks noChangeAspect="1"/>
@@ -1332,7 +1293,7 @@
                     <a:graphicData uri="http://schemas.openxmlformats.org/drawingml/2006/picture">
                       <pic:pic>
                         <pic:nvPicPr>
-                          <pic:cNvPr id="0" name="products_preview.png"/>
+                          <pic:cNvPr id="0" name="chatbot_active_preview.png"/>
                           <pic:cNvPicPr/>
                         </pic:nvPicPr>
                         <pic:blipFill>
@@ -1344,7 +1305,7 @@
                         <pic:spPr>
                           <a:xfrm>
                             <a:off x="0" y="0"/>
-                            <a:ext cx="5303520" cy="4972050"/>
+                            <a:ext cx="3931920" cy="2764631"/>
                           </a:xfrm>
                           <a:prstGeom prst="rect"/>
                         </pic:spPr>
@@ -1357,13 +1318,14 @@
           </w:p>
           <w:p>
             <w:pPr>
+              <w:spacing w:before="40" w:after="40"/>
               <w:jc w:val="center"/>
             </w:pPr>
             <w:r>
               <w:rPr>
                 <w:i/>
                 <w:color w:val="64748B"/>
-                <w:sz w:val="18"/>
+                <w:sz w:val="17"/>
               </w:rPr>
               <w:t>Figure E: Customer interacting with PulseBot shopping assistant directly through the live store catalogue.</w:t>
             </w:r>
@@ -1371,23 +1333,10 @@
         </w:tc>
       </w:tr>
     </w:tbl>
-    <w:p/>
     <w:p>
       <w:pPr>
-        <w:rPr>
-          <w:b/>
-          <w:sz w:val="26"/>
-        </w:rPr>
-      </w:pPr>
-      <w:r>
-        <w:rPr>
-          <w:b/>
-          <w:sz w:val="26"/>
-        </w:rPr>
-        <w:br w:type="page"/>
-      </w:r>
-    </w:p>
-    <w:p>
+        <w:pageBreakBefore/>
+      </w:pPr>
       <w:r>
         <w:rPr>
           <w:b/>
@@ -1607,6 +1556,9 @@
             <w:tcMar/>
           </w:tcPr>
           <w:p>
+            <w:pPr>
+              <w:spacing w:before="40" w:after="40"/>
+            </w:pPr>
             <w:r>
               <w:rPr>
                 <w:b/>
@@ -1622,6 +1574,9 @@
             <w:tcMar/>
           </w:tcPr>
           <w:p>
+            <w:pPr>
+              <w:spacing w:before="40" w:after="40"/>
+            </w:pPr>
             <w:r>
               <w:rPr>
                 <w:b/>
@@ -1633,7 +1588,6 @@
         </w:tc>
       </w:tr>
     </w:tbl>
-    <w:p/>
     <w:sectPr>
       <w:footerReference w:type="default" r:id="rId8"/>
       <w:pgSz w:w="12240" w:h="15840" w:orient="portrait"/>

</xml_diff>

<commit_message>
Update student name to Chirag Goenka across all documents, websites, reports, and screenshots
</commit_message>
<xml_diff>
--- a/IBM_SkillsBuild_Shop_Assistant_Chatbot_Completed_Template.docx
+++ b/IBM_SkillsBuild_Shop_Assistant_Chatbot_Completed_Template.docx
@@ -73,7 +73,7 @@
           <w:color w:val="0F172A"/>
           <w:sz w:val="22"/>
         </w:rPr>
-        <w:t>Student Name: Chirag</w:t>
+        <w:t>Student Name: Chirag Goenka</w:t>
       </w:r>
     </w:p>
     <w:p>
@@ -1146,7 +1146,7 @@
                 <w:color w:val="64748B"/>
                 <w:sz w:val="17"/>
               </w:rPr>
-              <w:t>Figure C: Actual live PulseBot dedicated AI Chatbot interface (Grade 9 A, Lakshmipat Singhania Academy).</w:t>
+              <w:t>Figure C: Actual live PulseBot dedicated AI Chatbot interface (Chirag Goenka, Grade 9 A, Lakshmipat Singhania Academy).</w:t>
             </w:r>
           </w:p>
         </w:tc>
@@ -1564,7 +1564,7 @@
                 <w:b/>
                 <w:sz w:val="20"/>
               </w:rPr>
-              <w:t>Student Name: Chirag</w:t>
+              <w:t>Student Name: Chirag Goenka</w:t>
             </w:r>
           </w:p>
         </w:tc>

</xml_diff>